<commit_message>
Fix Table 2 R² duplication and EN/JA Discussion consistency
- Table 2 Models 2-4: use R²adj in 'Key statistic' column instead of
  duplicating R² from 'Confounder R²' column (EN + JA)
- JA Discussion d2: remove unadj_d reference to match EN version
  ('顕著な地域差（未調整d=X.XX）' → '顕著な地域間クラスタリング')

Co-Authored-By: Tatsuki Onishi <bougtoir@gmail.com>
</commit_message>
<xml_diff>
--- a/ndb-pain-regional-variation-japan/output/je/JE_manuscript_EN.docx
+++ b/ndb-pain-regional-variation-japan/output/je/JE_manuscript_EN.docx
@@ -1429,7 +1429,7 @@
               <w:rPr>
                 <w:sz w:val="18"/>
               </w:rPr>
-              <w:t>R²=0.814</w:t>
+              <w:t>R²adj=0.791</w:t>
             </w:r>
           </w:p>
         </w:tc>
@@ -1483,7 +1483,7 @@
               <w:rPr>
                 <w:sz w:val="18"/>
               </w:rPr>
-              <w:t>R²=0.811</w:t>
+              <w:t>R²adj=0.788</w:t>
             </w:r>
           </w:p>
         </w:tc>
@@ -1537,7 +1537,7 @@
               <w:rPr>
                 <w:sz w:val="18"/>
               </w:rPr>
-              <w:t>R²=0.145</w:t>
+              <w:t>R²adj=0.041</w:t>
             </w:r>
           </w:p>
         </w:tc>

</xml_diff>

<commit_message>
Fix Table 2 Model 1 stat inconsistency + JA Figure 1 caption
- Table 2 Model 1: remove Cohen's d (from Tohoku binary test) and
  report only Kruskal-Wallis H, P<0.001 (9-region omnibus test)
- JA Figure 1 inline caption: add '棒は地域ブロック別に色分け' to
  match EN version's 'Bars are coloured by regional block'

Co-Authored-By: Tatsuki Onishi <bougtoir@gmail.com>
</commit_message>
<xml_diff>
--- a/ndb-pain-regional-variation-japan/output/je/JE_manuscript_EN.docx
+++ b/ndb-pain-regional-variation-japan/output/je/JE_manuscript_EN.docx
@@ -1375,7 +1375,7 @@
               <w:rPr>
                 <w:sz w:val="18"/>
               </w:rPr>
-              <w:t>d=2.81</w:t>
+              <w:t>Kruskal–Wallis H, P&lt;0.001</w:t>
             </w:r>
           </w:p>
         </w:tc>
@@ -1388,7 +1388,7 @@
               <w:rPr>
                 <w:sz w:val="18"/>
               </w:rPr>
-              <w:t>Kruskal–Wallis P&lt;0.001</w:t>
+              <w:t>Omnibus 9-region test</w:t>
             </w:r>
           </w:p>
         </w:tc>

</xml_diff>

<commit_message>
Fix reference verification errors: wrong DOIs, wrong authors
- Ref 6: Authors corrected Matsuoka et al. → Takahashi R, Miyashita M,
  Nakazawa Y, Wada S, Matsuoka Y; pages hyaf149 → 1372–7; DOI added
- Ref 11 (Anderson): DOI corrected 10.1016/j.jpain.2009.06.010 →
  10.1016/j.jpain.2009.10.002 (verified via PubMed PMID 19944378)
- Ref 13 (Callister): DOI corrected 10.1177/1084822303015004003 →
  10.1177/1084822302250687 (verified via CrossRef)
- Ref 17 (Onishi): DOI corrected 10.12688/f1000research.147085.2 →
  10.12688/f1000research.146215.1 (old DOI returned 404)

All 17 references verified against CrossRef/PubMed for authors, title,
journal, volume, pages, year, and DOI.

Co-Authored-By: Tatsuki Onishi <bougtoir@gmail.com>
</commit_message>
<xml_diff>
--- a/ndb-pain-regional-variation-japan/output/je/JE_manuscript_EN.docx
+++ b/ndb-pain-regional-variation-japan/output/je/JE_manuscript_EN.docx
@@ -2226,7 +2226,7 @@
         <w:t xml:space="preserve">6. </w:t>
       </w:r>
       <w:r>
-        <w:t>Matsuoka Y, Morishima T, Sato A, et al. Population-based claims study of regional and hospital function differences in opioid prescribing for cancer patients who died in hospital in Japan. Jpn J Clin Oncol. 2025;55:hyaf149.</w:t>
+        <w:t>Takahashi R, Miyashita M, Nakazawa Y, Wada S, Matsuoka Y. Population-based claims study of regional and hospital function differences in opioid prescribing for cancer patients who died in hospital in Japan. Jpn J Clin Oncol. 2025;55:1372–7. doi:10.1093/jjco/hyaf149</w:t>
       </w:r>
     </w:p>
     <w:p>
@@ -2281,7 +2281,7 @@
         <w:t xml:space="preserve">11. </w:t>
       </w:r>
       <w:r>
-        <w:t>Anderson KO, Green CR, Payne R. Racial and ethnic disparities in pain: causes and consequences of unequal care. J Pain. 2009;10:1187–204. doi:10.1016/j.jpain.2009.06.010</w:t>
+        <w:t>Anderson KO, Green CR, Payne R. Racial and ethnic disparities in pain: causes and consequences of unequal care. J Pain. 2009;10:1187–204. doi:10.1016/j.jpain.2009.10.002</w:t>
       </w:r>
     </w:p>
     <w:p>
@@ -2303,7 +2303,7 @@
         <w:t xml:space="preserve">13. </w:t>
       </w:r>
       <w:r>
-        <w:t>Callister LC. Cultural influences on pain perceptions and behaviors. Home Health Care Manag Pract. 2003;15:207–11. doi:10.1177/1084822303015004003</w:t>
+        <w:t>Callister LC. Cultural influences on pain perceptions and behaviors. Home Health Care Manag Pract. 2003;15:207–11. doi:10.1177/1084822302250687</w:t>
       </w:r>
     </w:p>
     <w:p>
@@ -2347,7 +2347,7 @@
         <w:t xml:space="preserve">17. </w:t>
       </w:r>
       <w:r>
-        <w:t>Onishi T, Onishi Y. Normalized pulse volume as a superior predictor of respiration recovery and quantification of nociception anti-nociception balance compared to opioid effect site concentration: a prospective, observational study. F1000Research. 2024;13:233. doi:10.12688/f1000research.147085.2</w:t>
+        <w:t>Onishi T, Onishi Y. Normalized pulse volume as a superior predictor of respiration recovery and quantification of nociception anti-nociception balance compared to opioid effect site concentration: a prospective, observational study. F1000Research. 2024;13:233. doi:10.12688/f1000research.146215.1</w:t>
       </w:r>
     </w:p>
     <w:p>

</xml_diff>

<commit_message>
Table 2: expand 'NS' to full spelling
EN: 'Regional indicators NS' → 'Regional indicators not significant'
JA: '地域指標NS' → '地域指標 有意差なし'
Co-Authored-By: Tatsuki Onishi <bougtoir@gmail.com>
</commit_message>
<xml_diff>
--- a/ndb-pain-regional-variation-japan/output/je/JE_manuscript_EN.docx
+++ b/ndb-pain-regional-variation-japan/output/je/JE_manuscript_EN.docx
@@ -1492,7 +1492,7 @@
               <w:rPr>
                 <w:sz w:val="18"/>
               </w:rPr>
-              <w:t>Regional indicators NS</w:t>
+              <w:t>Regional indicators not significant</w:t>
             </w:r>
           </w:p>
         </w:tc>
@@ -1546,7 +1546,7 @@
               <w:rPr>
                 <w:sz w:val="18"/>
               </w:rPr>
-              <w:t>Regional indicators NS</w:t>
+              <w:t>Regional indicators not significant</w:t>
             </w:r>
           </w:p>
         </w:tc>
@@ -1600,7 +1600,7 @@
               <w:rPr>
                 <w:sz w:val="18"/>
               </w:rPr>
-              <w:t>Regional indicators NS</w:t>
+              <w:t>Regional indicators not significant</w:t>
             </w:r>
           </w:p>
         </w:tc>
@@ -1654,7 +1654,7 @@
               <w:rPr>
                 <w:sz w:val="18"/>
               </w:rPr>
-              <w:t>Regional indicators NS</w:t>
+              <w:t>Regional indicators not significant</w:t>
             </w:r>
           </w:p>
         </w:tc>

</xml_diff>

<commit_message>
Table 2: replace 'not significant' with actual p-values
Note column now shows Regional β and P for each model:
- Model 2: β=32.6, P=0.150
- Model 3: β=15.7, P=0.229
- Model 4: β=0.08, P=0.863
- Model 5: β=31.5, P=0.149

Co-Authored-By: Tatsuki Onishi <bougtoir@gmail.com>
</commit_message>
<xml_diff>
--- a/ndb-pain-regional-variation-japan/output/je/JE_manuscript_EN.docx
+++ b/ndb-pain-regional-variation-japan/output/je/JE_manuscript_EN.docx
@@ -1492,7 +1492,7 @@
               <w:rPr>
                 <w:sz w:val="18"/>
               </w:rPr>
-              <w:t>Regional indicators not significant</w:t>
+              <w:t>Regional β=32.6, P=0.150</w:t>
             </w:r>
           </w:p>
         </w:tc>
@@ -1546,7 +1546,7 @@
               <w:rPr>
                 <w:sz w:val="18"/>
               </w:rPr>
-              <w:t>Regional indicators not significant</w:t>
+              <w:t>Regional β=15.7, P=0.229</w:t>
             </w:r>
           </w:p>
         </w:tc>
@@ -1600,7 +1600,7 @@
               <w:rPr>
                 <w:sz w:val="18"/>
               </w:rPr>
-              <w:t>Regional indicators not significant</w:t>
+              <w:t>Regional β=0.08, P=0.863</w:t>
             </w:r>
           </w:p>
         </w:tc>
@@ -1654,7 +1654,7 @@
               <w:rPr>
                 <w:sz w:val="18"/>
               </w:rPr>
-              <w:t>Regional indicators not significant</w:t>
+              <w:t>Regional β=31.5, P=0.149</w:t>
             </w:r>
           </w:p>
         </w:tc>

</xml_diff>

<commit_message>
All figures: grayscale/B&W print compatibility
- Fig 1,3 (bar charts): hatching patterns + gray shades per region
- Fig 2,4 (scatter plots): distinct marker shapes + gray shades per region
- Updated captions: remove 'coloured' references, describe marker/hatch distinction
- EN + JA versions updated consistently

Co-Authored-By: Tatsuki Onishi <bougtoir@gmail.com>
</commit_message>
<xml_diff>
--- a/ndb-pain-regional-variation-japan/output/je/JE_manuscript_EN.docx
+++ b/ndb-pain-regional-variation-japan/output/je/JE_manuscript_EN.docx
@@ -1162,7 +1162,7 @@
       <w:r>
         <w:drawing>
           <wp:inline xmlns:a="http://schemas.openxmlformats.org/drawingml/2006/main" xmlns:pic="http://schemas.openxmlformats.org/drawingml/2006/picture">
-            <wp:extent cx="5029200" cy="2180374"/>
+            <wp:extent cx="5029200" cy="2177896"/>
             <wp:docPr id="1" name="Picture 1"/>
             <wp:cNvGraphicFramePr>
               <a:graphicFrameLocks noChangeAspect="1"/>
@@ -1183,7 +1183,7 @@
                   <pic:spPr>
                     <a:xfrm>
                       <a:off x="0" y="0"/>
-                      <a:ext cx="5029200" cy="2180374"/>
+                      <a:ext cx="5029200" cy="2177896"/>
                     </a:xfrm>
                     <a:prstGeom prst="rect"/>
                   </pic:spPr>
@@ -1209,7 +1209,7 @@
         <w:rPr>
           <w:sz w:val="20"/>
         </w:rPr>
-        <w:t>Outpatient neuropathic pain drug prescribing per surgery by prefecture. Bars are coloured by regional block. Dashed line indicates the national mean.</w:t>
+        <w:t>Outpatient neuropathic pain drug prescribing per surgery by prefecture. Bars indicate regional blocks (distinguished by shading and hatch pattern). Dashed line indicates the national mean.</w:t>
       </w:r>
     </w:p>
     <w:p>
@@ -1237,7 +1237,7 @@
       <w:r>
         <w:drawing>
           <wp:inline xmlns:a="http://schemas.openxmlformats.org/drawingml/2006/main" xmlns:pic="http://schemas.openxmlformats.org/drawingml/2006/picture">
-            <wp:extent cx="5029200" cy="4523868"/>
+            <wp:extent cx="5029200" cy="4429365"/>
             <wp:docPr id="2" name="Picture 2"/>
             <wp:cNvGraphicFramePr>
               <a:graphicFrameLocks noChangeAspect="1"/>
@@ -1258,7 +1258,7 @@
                   <pic:spPr>
                     <a:xfrm>
                       <a:off x="0" y="0"/>
-                      <a:ext cx="5029200" cy="4523868"/>
+                      <a:ext cx="5029200" cy="4429365"/>
                     </a:xfrm>
                     <a:prstGeom prst="rect"/>
                   </pic:spPr>
@@ -1674,7 +1674,7 @@
       <w:r>
         <w:drawing>
           <wp:inline xmlns:a="http://schemas.openxmlformats.org/drawingml/2006/main" xmlns:pic="http://schemas.openxmlformats.org/drawingml/2006/picture">
-            <wp:extent cx="5029200" cy="2182483"/>
+            <wp:extent cx="5029200" cy="2164339"/>
             <wp:docPr id="3" name="Picture 3"/>
             <wp:cNvGraphicFramePr>
               <a:graphicFrameLocks noChangeAspect="1"/>
@@ -1695,7 +1695,7 @@
                   <pic:spPr>
                     <a:xfrm>
                       <a:off x="0" y="0"/>
-                      <a:ext cx="5029200" cy="2182483"/>
+                      <a:ext cx="5029200" cy="2164339"/>
                     </a:xfrm>
                     <a:prstGeom prst="rect"/>
                   </pic:spPr>
@@ -1801,7 +1801,7 @@
         <w:rPr>
           <w:sz w:val="20"/>
         </w:rPr>
-        <w:t>Demand–supply dissociation: CSLC symptom prevalence rate (per 1,000 population) vs acute analgesic prescribing per surgery across 47 prefectures. Each dot represents one prefecture, coloured by regional block. The near-zero correlation (r=0.03) indicates that prescribing variation is dissociated from symptom burden.</w:t>
+        <w:t>Demand–supply dissociation: CSLC symptom prevalence rate (per 1,000 population) vs acute analgesic prescribing per surgery across 47 prefectures. Each marker shape represents a regional block. The near-zero correlation (r=0.03) indicates that prescribing variation is dissociated from symptom burden.</w:t>
       </w:r>
     </w:p>
     <w:p>
@@ -2379,7 +2379,7 @@
         <w:rPr>
           <w:sz w:val="22"/>
         </w:rPr>
-        <w:t>Outpatient neuropathic pain drug prescribing per surgery by prefecture. Bars represent individual prefectures ordered by prescribing index. Bars are coloured by regional block. Dashed line indicates the national mean.</w:t>
+        <w:t>Outpatient neuropathic pain drug prescribing per surgery by prefecture. Bars represent individual prefectures ordered by prescribing index. Bars indicate regional blocks (distinguished by shading and hatch pattern). Dashed line indicates the national mean.</w:t>
       </w:r>
     </w:p>
     <w:p>
@@ -2394,7 +2394,7 @@
         <w:rPr>
           <w:sz w:val="22"/>
         </w:rPr>
-        <w:t>Correlation between neuropathic pain prescribing and confounder disease proxies across 47 prefectures. Each dot represents one prefecture. Diabetes drugs show the strongest correlation (r=0.87).</w:t>
+        <w:t>Correlation between neuropathic pain prescribing and confounder disease proxies across 47 prefectures. Each marker shape represents a regional block. Diabetes drugs show the strongest correlation (r=0.87).</w:t>
       </w:r>
     </w:p>
     <w:p>
@@ -2424,7 +2424,7 @@
         <w:rPr>
           <w:sz w:val="22"/>
         </w:rPr>
-        <w:t>Demand–supply dissociation: CSLC symptom prevalence rate (per 1,000 population) vs acute analgesic prescribing per surgery across 47 prefectures. Each dot represents one prefecture, coloured by regional block. The near-zero correlation (r=0.03, P=0.85) indicates that prescribing variation is dissociated from symptom burden.</w:t>
+        <w:t>Demand–supply dissociation: CSLC symptom prevalence rate (per 1,000 population) vs acute analgesic prescribing per surgery across 47 prefectures. Each marker shape represents a regional block. The near-zero correlation (r=0.03, P=0.85) indicates that prescribing variation is dissociated from symptom burden.</w:t>
       </w:r>
     </w:p>
     <w:sectPr>

</xml_diff>

<commit_message>
Restore colours: colour + hatch/marker for dual print compatibility
Bars: original colours preserved, hatching overlay added for B&W
Scatter: original colours preserved, distinct marker shapes added for B&W
Captions updated to describe 'colour and hatch/shape' distinction

Co-Authored-By: Tatsuki Onishi <bougtoir@gmail.com>
</commit_message>
<xml_diff>
--- a/ndb-pain-regional-variation-japan/output/je/JE_manuscript_EN.docx
+++ b/ndb-pain-regional-variation-japan/output/je/JE_manuscript_EN.docx
@@ -1209,7 +1209,7 @@
         <w:rPr>
           <w:sz w:val="20"/>
         </w:rPr>
-        <w:t>Outpatient neuropathic pain drug prescribing per surgery by prefecture. Bars indicate regional blocks (distinguished by shading and hatch pattern). Dashed line indicates the national mean.</w:t>
+        <w:t>Outpatient neuropathic pain drug prescribing per surgery by prefecture. Bars indicate regional blocks (distinguished by colour and hatch pattern). Dashed line indicates the national mean.</w:t>
       </w:r>
     </w:p>
     <w:p>
@@ -2379,7 +2379,7 @@
         <w:rPr>
           <w:sz w:val="22"/>
         </w:rPr>
-        <w:t>Outpatient neuropathic pain drug prescribing per surgery by prefecture. Bars represent individual prefectures ordered by prescribing index. Bars indicate regional blocks (distinguished by shading and hatch pattern). Dashed line indicates the national mean.</w:t>
+        <w:t>Outpatient neuropathic pain drug prescribing per surgery by prefecture. Bars represent individual prefectures ordered by prescribing index. Bars indicate regional blocks (distinguished by colour and hatch pattern). Dashed line indicates the national mean.</w:t>
       </w:r>
     </w:p>
     <w:p>
@@ -2394,7 +2394,7 @@
         <w:rPr>
           <w:sz w:val="22"/>
         </w:rPr>
-        <w:t>Correlation between neuropathic pain prescribing and confounder disease proxies across 47 prefectures. Each marker shape represents a regional block. Diabetes drugs show the strongest correlation (r=0.87).</w:t>
+        <w:t>Correlation between neuropathic pain prescribing and confounder disease proxies across 47 prefectures. Each marker represents a regional block (distinguished by colour and shape). Diabetes drugs show the strongest correlation (r=0.87).</w:t>
       </w:r>
     </w:p>
     <w:p>

</xml_diff>